<commit_message>
Preserve Pi system prompts when encoding teacher trajectories
</commit_message>
<xml_diff>
--- a/docs/reports/03-蒸馏.docx
+++ b/docs/reports/03-蒸馏.docx
@@ -12,7 +12,7 @@
     </w:p>
     <w:p>
       <w:r>
-        <w:t>更新：2026-10-03T11:59:22+08:00。本册按实际实验整理，原始运行记录单独保存。</w:t>
+        <w:t>更新：2026-10-03T12:36:55+08:00。本册按实际实验整理，原始运行记录单独保存。</w:t>
       </w:r>
     </w:p>
     <w:p>
@@ -1122,6 +1122,530 @@
         </w:tc>
       </w:tr>
     </w:tbl>
+    <w:p>
+      <w:pPr>
+        <w:pStyle w:val="Heading1"/>
+        <w:pageBreakBefore/>
+      </w:pPr>
+      <w:r>
+        <w:t>E16：教师轨迹的执行与筛选</w:t>
+      </w:r>
+    </w:p>
+    <w:p>
+      <w:r>
+        <w:t>教师处理冻结train请求。首批512条覆盖八类、16个训练模板族；有效量不足256条时，每批扩展128条，最多1024条。模型输入只有任务提示、工具定义和实际工具返回，不包含参考解。</w:t>
+      </w:r>
+    </w:p>
+    <w:p>
+      <w:r>
+        <w:t>实际已处理52条，执行与格式初筛接受13条。所有拒绝、截断、超时和预算耗尽均保留；初筛轨迹还要经过完整历史的token编码与监督边界检查，才能计为可训练样本。</w:t>
+      </w:r>
+    </w:p>
+    <w:p>
+      <w:pPr>
+        <w:pStyle w:val="Heading2"/>
+      </w:pPr>
+      <w:r>
+        <w:t>每条轨迹检查什么</w:t>
+      </w:r>
+    </w:p>
+    <w:p>
+      <w:r>
+        <w:t>每题在新的无网络容器中执行。最终状态通过、工具名和参数schema正确、调用与返回一一对应且没有截断或超时的轨迹，才进入完整编码。发生错误后成功恢复的过程可以保留；JSON正确而任务失败仍被拒绝。</w:t>
+      </w:r>
+    </w:p>
+    <w:p>
+      <w:pPr>
+        <w:pStyle w:val="CodeBlock"/>
+        <w:shd w:fill="F3F4F6"/>
+      </w:pPr>
+      <w:r>
+        <w:t>eligible = task_passed and valid_schema and matched_results</w:t>
+        <w:br/>
+        <w:t>eligible = eligible and not (timeout or truncated or budget_exhausted)</w:t>
+      </w:r>
+    </w:p>
+    <w:tbl>
+      <w:tblPr>
+        <w:tblStyle w:val="TableGrid"/>
+        <w:tblW w:type="auto" w:w="0"/>
+        <w:tblLook w:firstColumn="1" w:firstRow="1" w:lastColumn="0" w:lastRow="0" w:noHBand="0" w:noVBand="1" w:val="04A0"/>
+      </w:tblPr>
+      <w:tblGrid>
+        <w:gridCol w:w="4819"/>
+        <w:gridCol w:w="4819"/>
+      </w:tblGrid>
+      <w:tr>
+        <w:trPr>
+          <w:cantSplit/>
+          <w:tblHeader/>
+        </w:trPr>
+        <w:tc>
+          <w:tcPr>
+            <w:tcW w:type="dxa" w:w="4819"/>
+            <w:shd w:fill="F3F4F6"/>
+          </w:tcPr>
+          <w:p>
+            <w:pPr>
+              <w:keepNext/>
+              <w:spacing w:after="40" w:line="240" w:lineRule="auto"/>
+            </w:pPr>
+            <w:r>
+              <w:rPr>
+                <w:b/>
+              </w:rPr>
+              <w:t>拒绝原因</w:t>
+            </w:r>
+          </w:p>
+        </w:tc>
+        <w:tc>
+          <w:tcPr>
+            <w:tcW w:type="dxa" w:w="4819"/>
+            <w:shd w:fill="F3F4F6"/>
+          </w:tcPr>
+          <w:p>
+            <w:pPr>
+              <w:keepNext/>
+              <w:spacing w:after="40" w:line="240" w:lineRule="auto"/>
+            </w:pPr>
+            <w:r>
+              <w:rPr>
+                <w:b/>
+              </w:rPr>
+              <w:t>涉及轨迹数</w:t>
+            </w:r>
+          </w:p>
+        </w:tc>
+      </w:tr>
+      <w:tr>
+        <w:trPr>
+          <w:cantSplit/>
+        </w:trPr>
+        <w:tc>
+          <w:tcPr>
+            <w:tcW w:type="dxa" w:w="4819"/>
+          </w:tcPr>
+          <w:p>
+            <w:pPr>
+              <w:spacing w:after="40" w:line="240" w:lineRule="auto"/>
+            </w:pPr>
+            <w:r>
+              <w:t>malformed_tool_call</w:t>
+            </w:r>
+          </w:p>
+        </w:tc>
+        <w:tc>
+          <w:tcPr>
+            <w:tcW w:type="dxa" w:w="4819"/>
+          </w:tcPr>
+          <w:p>
+            <w:pPr>
+              <w:spacing w:after="40" w:line="240" w:lineRule="auto"/>
+            </w:pPr>
+            <w:r>
+              <w:t>3</w:t>
+            </w:r>
+          </w:p>
+        </w:tc>
+      </w:tr>
+      <w:tr>
+        <w:trPr>
+          <w:cantSplit/>
+        </w:trPr>
+        <w:tc>
+          <w:tcPr>
+            <w:tcW w:type="dxa" w:w="4819"/>
+          </w:tcPr>
+          <w:p>
+            <w:pPr>
+              <w:spacing w:after="40" w:line="240" w:lineRule="auto"/>
+            </w:pPr>
+            <w:r>
+              <w:t>task_failed</w:t>
+            </w:r>
+          </w:p>
+        </w:tc>
+        <w:tc>
+          <w:tcPr>
+            <w:tcW w:type="dxa" w:w="4819"/>
+          </w:tcPr>
+          <w:p>
+            <w:pPr>
+              <w:spacing w:after="40" w:line="240" w:lineRule="auto"/>
+            </w:pPr>
+            <w:r>
+              <w:t>39</w:t>
+            </w:r>
+          </w:p>
+        </w:tc>
+      </w:tr>
+      <w:tr>
+        <w:trPr>
+          <w:cantSplit/>
+        </w:trPr>
+        <w:tc>
+          <w:tcPr>
+            <w:tcW w:type="dxa" w:w="4819"/>
+          </w:tcPr>
+          <w:p>
+            <w:pPr>
+              <w:spacing w:after="40" w:line="240" w:lineRule="auto"/>
+            </w:pPr>
+            <w:r>
+              <w:t>tool_budget_exhausted</w:t>
+            </w:r>
+          </w:p>
+        </w:tc>
+        <w:tc>
+          <w:tcPr>
+            <w:tcW w:type="dxa" w:w="4819"/>
+          </w:tcPr>
+          <w:p>
+            <w:pPr>
+              <w:spacing w:after="40" w:line="240" w:lineRule="auto"/>
+            </w:pPr>
+            <w:r>
+              <w:t>7</w:t>
+            </w:r>
+          </w:p>
+        </w:tc>
+      </w:tr>
+      <w:tr>
+        <w:trPr>
+          <w:cantSplit/>
+        </w:trPr>
+        <w:tc>
+          <w:tcPr>
+            <w:tcW w:type="dxa" w:w="4819"/>
+          </w:tcPr>
+          <w:p>
+            <w:pPr>
+              <w:spacing w:after="40" w:line="240" w:lineRule="auto"/>
+            </w:pPr>
+            <w:r>
+              <w:t>truncated_or_cancelled</w:t>
+            </w:r>
+          </w:p>
+        </w:tc>
+        <w:tc>
+          <w:tcPr>
+            <w:tcW w:type="dxa" w:w="4819"/>
+          </w:tcPr>
+          <w:p>
+            <w:pPr>
+              <w:spacing w:after="40" w:line="240" w:lineRule="auto"/>
+            </w:pPr>
+            <w:r>
+              <w:t>3</w:t>
+            </w:r>
+          </w:p>
+        </w:tc>
+      </w:tr>
+    </w:tbl>
+    <w:p>
+      <w:pPr>
+        <w:keepNext/>
+        <w:spacing w:before="120"/>
+        <w:jc w:val="center"/>
+      </w:pPr>
+      <w:r>
+        <w:drawing>
+          <wp:inline xmlns:a="http://schemas.openxmlformats.org/drawingml/2006/main" xmlns:pic="http://schemas.openxmlformats.org/drawingml/2006/picture">
+            <wp:extent cx="5400000" cy="2700000"/>
+            <wp:docPr id="2" name="Picture 2"/>
+            <wp:cNvGraphicFramePr>
+              <a:graphicFrameLocks noChangeAspect="1"/>
+            </wp:cNvGraphicFramePr>
+            <a:graphic>
+              <a:graphicData uri="http://schemas.openxmlformats.org/drawingml/2006/picture">
+                <pic:pic>
+                  <pic:nvPicPr>
+                    <pic:cNvPr id="0" name="E16-1.png"/>
+                    <pic:cNvPicPr/>
+                  </pic:nvPicPr>
+                  <pic:blipFill>
+                    <a:blip r:embed="rId12"/>
+                    <a:stretch>
+                      <a:fillRect/>
+                    </a:stretch>
+                  </pic:blipFill>
+                  <pic:spPr>
+                    <a:xfrm>
+                      <a:off x="0" y="0"/>
+                      <a:ext cx="5400000" cy="2700000"/>
+                    </a:xfrm>
+                    <a:prstGeom prst="rect"/>
+                  </pic:spPr>
+                </pic:pic>
+              </a:graphicData>
+            </a:graphic>
+          </wp:inline>
+        </w:drawing>
+      </w:r>
+    </w:p>
+    <w:p>
+      <w:pPr>
+        <w:jc w:val="center"/>
+      </w:pPr>
+      <w:r>
+        <w:t>图 E16-1：逐条执行的累计初筛接受数量</w:t>
+      </w:r>
+    </w:p>
+    <w:p>
+      <w:pPr>
+        <w:pStyle w:val="Heading2"/>
+      </w:pPr>
+      <w:r>
+        <w:t>Pi 消息怎样变成训练单元</w:t>
+      </w:r>
+    </w:p>
+    <w:p>
+      <w:r>
+        <w:t>Pi 的原生 system 消息可以只有空 content，实际提示保存在结构化 sections 中。转换时使用同版本 Pi 渲染器恢复完整系统提示，包括工作目录；不能把空 content 当成空提示，也不能把 system 角色当作用户消息。</w:t>
+      </w:r>
+    </w:p>
+    <w:p>
+      <w:r>
+        <w:t>对已落盘的40条请求快照检查，初筛接受的10条均完整编码成功，展开为27个当前回复训练单元，共2173个监督token；最长输入2940 tokens。这是运行中快照，尚未达到256条目标。</w:t>
+      </w:r>
+    </w:p>
+    <w:p>
+      <w:r>
+        <w:t>27个推理前缀的token哈希与实际API记录逐一相同，规范化消息哈希也相同；历史消息与工具返回不参与当前回复loss。检查没有初始化CUDA，不占用教师推理GPU。</w:t>
+      </w:r>
+    </w:p>
+    <w:p>
+      <w:pPr>
+        <w:pStyle w:val="CodeBlock"/>
+        <w:shd w:fill="F3F4F6"/>
+      </w:pPr>
+      <w:r>
+        <w:t>history = messages[:target_message_index]</w:t>
+        <w:br/>
+        <w:t>assert sha256(render_tokens(history)) == request["prompt_sha256"]</w:t>
+        <w:br/>
+        <w:t>labels[:target_start] = -100</w:t>
+      </w:r>
+    </w:p>
+    <w:p>
+      <w:pPr>
+        <w:pStyle w:val="Heading2"/>
+      </w:pPr>
+      <w:r>
+        <w:t>阶段结论</w:t>
+      </w:r>
+    </w:p>
+    <w:p>
+      <w:r>
+        <w:t>请求仍在顺序执行；当前初筛13/52。这是训练请求的接受率，不能作为dev或test成功率。</w:t>
+      </w:r>
+    </w:p>
+    <w:p>
+      <w:pPr>
+        <w:pStyle w:val="Heading2"/>
+      </w:pPr>
+      <w:r>
+        <w:t>证据索引</w:t>
+      </w:r>
+    </w:p>
+    <w:tbl>
+      <w:tblPr>
+        <w:tblStyle w:val="TableGrid"/>
+        <w:tblW w:type="auto" w:w="0"/>
+        <w:tblLayout w:type="fixed"/>
+        <w:tblLook w:firstColumn="1" w:firstRow="1" w:lastColumn="0" w:lastRow="0" w:noHBand="0" w:noVBand="1" w:val="04A0"/>
+        <w:tblLayout w:type="fixed"/>
+      </w:tblPr>
+      <w:tblGrid>
+        <w:gridCol w:w="2381"/>
+        <w:gridCol w:w="7200"/>
+      </w:tblGrid>
+      <w:tr>
+        <w:trPr>
+          <w:cantSplit/>
+          <w:tblHeader/>
+        </w:trPr>
+        <w:tc>
+          <w:tcPr>
+            <w:tcW w:type="dxa" w:w="2381"/>
+            <w:shd w:fill="F3F4F6"/>
+          </w:tcPr>
+          <w:p>
+            <w:pPr>
+              <w:keepNext/>
+              <w:spacing w:after="40" w:line="240" w:lineRule="auto"/>
+            </w:pPr>
+            <w:r>
+              <w:rPr>
+                <w:b/>
+              </w:rPr>
+              <w:t>内容</w:t>
+            </w:r>
+          </w:p>
+        </w:tc>
+        <w:tc>
+          <w:tcPr>
+            <w:tcW w:type="dxa" w:w="7200"/>
+            <w:shd w:fill="F3F4F6"/>
+          </w:tcPr>
+          <w:p>
+            <w:pPr>
+              <w:keepNext/>
+              <w:spacing w:after="40" w:line="240" w:lineRule="auto"/>
+            </w:pPr>
+            <w:r>
+              <w:rPr>
+                <w:b/>
+              </w:rPr>
+              <w:t>对应记录</w:t>
+            </w:r>
+          </w:p>
+        </w:tc>
+      </w:tr>
+      <w:tr>
+        <w:trPr>
+          <w:cantSplit/>
+        </w:trPr>
+        <w:tc>
+          <w:tcPr>
+            <w:tcW w:type="dxa" w:w="2381"/>
+          </w:tcPr>
+          <w:p>
+            <w:pPr>
+              <w:spacing w:after="40" w:line="240" w:lineRule="auto"/>
+            </w:pPr>
+            <w:r>
+              <w:t>冻结请求与教师条件</w:t>
+            </w:r>
+          </w:p>
+        </w:tc>
+        <w:tc>
+          <w:tcPr>
+            <w:tcW w:type="dxa" w:w="7200"/>
+          </w:tcPr>
+          <w:p>
+            <w:pPr>
+              <w:spacing w:after="40" w:line="240" w:lineRule="auto"/>
+            </w:pPr>
+            <w:r>
+              <w:t>configs/teacher-requests-frozen.json</w:t>
+            </w:r>
+            <w:r>
+              <w:rPr>
+                <w:rFonts w:ascii="Consolas" w:hAnsi="Consolas"/>
+                <w:sz w:val="20"/>
+              </w:rPr>
+              <w:t>；</w:t>
+            </w:r>
+            <w:r>
+              <w:t>.local/runs/E16-R01/config.json</w:t>
+            </w:r>
+          </w:p>
+        </w:tc>
+      </w:tr>
+      <w:tr>
+        <w:trPr>
+          <w:cantSplit/>
+        </w:trPr>
+        <w:tc>
+          <w:tcPr>
+            <w:tcW w:type="dxa" w:w="2381"/>
+          </w:tcPr>
+          <w:p>
+            <w:pPr>
+              <w:spacing w:after="40" w:line="240" w:lineRule="auto"/>
+            </w:pPr>
+            <w:r>
+              <w:t>逐题执行与本机生成</w:t>
+            </w:r>
+          </w:p>
+        </w:tc>
+        <w:tc>
+          <w:tcPr>
+            <w:tcW w:type="dxa" w:w="7200"/>
+          </w:tcPr>
+          <w:p>
+            <w:pPr>
+              <w:spacing w:after="40" w:line="240" w:lineRule="auto"/>
+            </w:pPr>
+            <w:r>
+              <w:t>.local/runs/E16-R01/records.jsonl</w:t>
+            </w:r>
+            <w:r>
+              <w:rPr>
+                <w:rFonts w:ascii="Consolas" w:hAnsi="Consolas"/>
+                <w:sz w:val="20"/>
+              </w:rPr>
+              <w:t>；</w:t>
+            </w:r>
+            <w:r>
+              <w:t>model-api.jsonl</w:t>
+            </w:r>
+            <w:r>
+              <w:rPr>
+                <w:rFonts w:ascii="Consolas" w:hAnsi="Consolas"/>
+                <w:sz w:val="20"/>
+              </w:rPr>
+              <w:t>；</w:t>
+            </w:r>
+            <w:r>
+              <w:t>tasks.json</w:t>
+            </w:r>
+          </w:p>
+        </w:tc>
+      </w:tr>
+      <w:tr>
+        <w:trPr>
+          <w:cantSplit/>
+        </w:trPr>
+        <w:tc>
+          <w:tcPr>
+            <w:tcW w:type="dxa" w:w="2381"/>
+          </w:tcPr>
+          <w:p>
+            <w:pPr>
+              <w:spacing w:after="40" w:line="240" w:lineRule="auto"/>
+            </w:pPr>
+            <w:r>
+              <w:t>编码快照核对</w:t>
+            </w:r>
+          </w:p>
+        </w:tc>
+        <w:tc>
+          <w:tcPr>
+            <w:tcW w:type="dxa" w:w="7200"/>
+          </w:tcPr>
+          <w:p>
+            <w:pPr>
+              <w:spacing w:after="40" w:line="240" w:lineRule="auto"/>
+            </w:pPr>
+            <w:r>
+              <w:t>experiments/E16/encoding-inspection.json</w:t>
+            </w:r>
+            <w:r>
+              <w:rPr>
+                <w:rFonts w:ascii="Consolas" w:hAnsi="Consolas"/>
+                <w:sz w:val="20"/>
+              </w:rPr>
+              <w:t>；</w:t>
+            </w:r>
+            <w:r>
+              <w:t>.local/checks/E16-R01-encoding/records-snapshot.jsonl</w:t>
+            </w:r>
+            <w:r>
+              <w:rPr>
+                <w:rFonts w:ascii="Consolas" w:hAnsi="Consolas"/>
+                <w:sz w:val="20"/>
+              </w:rPr>
+              <w:t>；</w:t>
+            </w:r>
+            <w:r>
+              <w:t>records-snapshot.inspection.json</w:t>
+            </w:r>
+          </w:p>
+        </w:tc>
+      </w:tr>
+    </w:tbl>
     <w:sectPr>
       <w:headerReference w:type="default" r:id="rId9"/>
       <w:footerReference w:type="default" r:id="rId10"/>

</xml_diff>

<commit_message>
docs: verify E16 encoding snapshot and rendered report
</commit_message>
<xml_diff>
--- a/docs/reports/03-蒸馏.docx
+++ b/docs/reports/03-蒸馏.docx
@@ -12,7 +12,7 @@
     </w:p>
     <w:p>
       <w:r>
-        <w:t>更新：2026-10-03T15:51:09+08:00。本册按实际实验整理，原始运行记录单独保存。</w:t>
+        <w:t>更新：2026-10-03T16:27:16+08:00。本册按实际实验整理，原始运行记录单独保存。</w:t>
       </w:r>
     </w:p>
     <w:p>
@@ -1138,7 +1138,7 @@
     </w:p>
     <w:p>
       <w:r>
-        <w:t>实际已处理476条，执行与格式初筛接受105条。所有拒绝、截断、超时和预算耗尽均保留；初筛轨迹还要经过完整历史的token编码与监督边界检查，才能计为可训练样本。</w:t>
+        <w:t>实际已处理551条，执行与格式初筛接受125条。所有拒绝、截断、超时和预算耗尽均保留；初筛轨迹还要经过完整历史的token编码与监督边界检查，才能计为可训练样本。</w:t>
       </w:r>
     </w:p>
     <w:p>
@@ -1243,7 +1243,7 @@
               <w:spacing w:after="40" w:line="240" w:lineRule="auto"/>
             </w:pPr>
             <w:r>
-              <w:t>26</w:t>
+              <w:t>29</w:t>
             </w:r>
           </w:p>
         </w:tc>
@@ -1274,7 +1274,7 @@
               <w:spacing w:after="40" w:line="240" w:lineRule="auto"/>
             </w:pPr>
             <w:r>
-              <w:t>371</w:t>
+              <w:t>426</w:t>
             </w:r>
           </w:p>
         </w:tc>
@@ -1305,7 +1305,7 @@
               <w:spacing w:after="40" w:line="240" w:lineRule="auto"/>
             </w:pPr>
             <w:r>
-              <w:t>62</w:t>
+              <w:t>73</w:t>
             </w:r>
           </w:p>
         </w:tc>
@@ -1336,7 +1336,7 @@
               <w:spacing w:after="40" w:line="240" w:lineRule="auto"/>
             </w:pPr>
             <w:r>
-              <w:t>26</w:t>
+              <w:t>28</w:t>
             </w:r>
           </w:p>
         </w:tc>
@@ -1437,12 +1437,12 @@
     </w:p>
     <w:p>
       <w:r>
-        <w:t>对已落盘的474条请求快照检查，初筛接受的105条均完整编码成功，展开为270个当前回复训练单元，共20021个监督token；最长输入2940 tokens。这是运行中快照，尚未达到256条目标。</w:t>
+        <w:t>对已落盘的550条请求快照检查，初筛接受的125条均完整编码成功，展开为333个当前回复训练单元，共25033个监督token；最长输入2940 tokens。这是运行中快照，尚未达到256条目标。</w:t>
       </w:r>
     </w:p>
     <w:p>
       <w:r>
-        <w:t>270个推理前缀的token哈希与实际API记录逐一相同，规范化消息哈希也相同；历史消息与工具返回不参与当前回复loss。检查没有初始化CUDA，不占用教师推理GPU。</w:t>
+        <w:t>333个推理前缀的token哈希与实际API记录逐一相同，规范化消息哈希也相同；历史消息与工具返回不参与当前回复loss。检查没有初始化CUDA，不占用教师推理GPU。</w:t>
       </w:r>
     </w:p>
     <w:p>
@@ -1468,7 +1468,7 @@
     </w:p>
     <w:p>
       <w:r>
-        <w:t>请求仍在顺序执行；当前初筛105/476。这是训练请求的接受率，不能作为dev或test成功率。</w:t>
+        <w:t>请求仍在顺序执行；当前初筛125/551。这是训练请求的接受率，不能作为dev或test成功率。</w:t>
       </w:r>
     </w:p>
     <w:p>
@@ -1661,7 +1661,7 @@
               <w:t>；</w:t>
             </w:r>
             <w:r>
-              <w:t>.local/checks/E16-R01-encoding/records-474-snapshot.jsonl</w:t>
+              <w:t>.local/checks/E16-R01-encoding/records-550-snapshot.jsonl</w:t>
             </w:r>
             <w:r>
               <w:rPr>
@@ -1671,7 +1671,7 @@
               <w:t>；</w:t>
             </w:r>
             <w:r>
-              <w:t>.local/checks/E16-R01-encoding/records-474-snapshot.inspection.json</w:t>
+              <w:t>.local/checks/E16-R01-encoding/records-550-snapshot.inspection.json</w:t>
             </w:r>
           </w:p>
         </w:tc>

</xml_diff>

<commit_message>
docs: archive and check current teacher-generation report
</commit_message>
<xml_diff>
--- a/docs/reports/03-蒸馏.docx
+++ b/docs/reports/03-蒸馏.docx
@@ -12,7 +12,7 @@
     </w:p>
     <w:p>
       <w:r>
-        <w:t>更新：2026-10-03T16:27:16+08:00。本册按实际实验整理，原始运行记录单独保存。</w:t>
+        <w:t>更新：2026-10-03T16:41:11+08:00。本册按实际实验整理，原始运行记录单独保存。</w:t>
       </w:r>
     </w:p>
     <w:p>
@@ -1138,7 +1138,7 @@
     </w:p>
     <w:p>
       <w:r>
-        <w:t>实际已处理551条，执行与格式初筛接受125条。所有拒绝、截断、超时和预算耗尽均保留；初筛轨迹还要经过完整历史的token编码与监督边界检查，才能计为可训练样本。</w:t>
+        <w:t>实际已处理583条，执行与格式初筛接受132条。所有拒绝、截断、超时和预算耗尽均保留；初筛轨迹还要经过完整历史的token编码与监督边界检查，才能计为可训练样本。</w:t>
       </w:r>
     </w:p>
     <w:p>
@@ -1243,7 +1243,7 @@
               <w:spacing w:after="40" w:line="240" w:lineRule="auto"/>
             </w:pPr>
             <w:r>
-              <w:t>29</w:t>
+              <w:t>30</w:t>
             </w:r>
           </w:p>
         </w:tc>
@@ -1274,7 +1274,7 @@
               <w:spacing w:after="40" w:line="240" w:lineRule="auto"/>
             </w:pPr>
             <w:r>
-              <w:t>426</w:t>
+              <w:t>451</w:t>
             </w:r>
           </w:p>
         </w:tc>
@@ -1305,7 +1305,7 @@
               <w:spacing w:after="40" w:line="240" w:lineRule="auto"/>
             </w:pPr>
             <w:r>
-              <w:t>73</w:t>
+              <w:t>76</w:t>
             </w:r>
           </w:p>
         </w:tc>
@@ -1336,7 +1336,7 @@
               <w:spacing w:after="40" w:line="240" w:lineRule="auto"/>
             </w:pPr>
             <w:r>
-              <w:t>28</w:t>
+              <w:t>30</w:t>
             </w:r>
           </w:p>
         </w:tc>
@@ -1468,7 +1468,7 @@
     </w:p>
     <w:p>
       <w:r>
-        <w:t>请求仍在顺序执行；当前初筛125/551。这是训练请求的接受率，不能作为dev或test成功率。</w:t>
+        <w:t>请求仍在顺序执行；当前初筛132/583。这是训练请求的接受率，不能作为dev或test成功率。</w:t>
       </w:r>
     </w:p>
     <w:p>

</xml_diff>

<commit_message>
docs: preserve stopped teacher generation and verified evidence
</commit_message>
<xml_diff>
--- a/docs/reports/03-蒸馏.docx
+++ b/docs/reports/03-蒸馏.docx
@@ -12,7 +12,7 @@
     </w:p>
     <w:p>
       <w:r>
-        <w:t>更新：2026-10-03T16:41:11+08:00。本册按实际实验整理，原始运行记录单独保存。</w:t>
+        <w:t>更新：2026-10-03T17:03:22+08:00。本册按实际实验整理，原始运行记录单独保存。</w:t>
       </w:r>
     </w:p>
     <w:p>
@@ -31,6 +31,11 @@
     <w:p>
       <w:r>
         <w:t>各条件保留自己的提示、任务分母、耗时和错误。未执行的蒸馏训练与规模比较不计为结果。</w:t>
+      </w:r>
+    </w:p>
+    <w:p>
+      <w:r>
+        <w:t>教师生成停止时完成614条训练请求，139条通过实际执行与完整编码，展开为367个回复单元、27294个监督token。有效轨迹尚未达到256条，且只覆盖八类任务中的四类；蒸馏训练与规模对照保持未执行。</w:t>
       </w:r>
     </w:p>
     <w:p>
@@ -1138,7 +1143,7 @@
     </w:p>
     <w:p>
       <w:r>
-        <w:t>实际已处理583条，执行与格式初筛接受132条。所有拒绝、截断、超时和预算耗尽均保留；初筛轨迹还要经过完整历史的token编码与监督边界检查，才能计为可训练样本。</w:t>
+        <w:t>生成已停止，实际完成614条请求，执行与格式初筛接受139条。本批640条中的其余26条没有完整结果，不计作模型失败。所有已完成请求的拒绝、截断和预算耗尽记录均保留。</w:t>
       </w:r>
     </w:p>
     <w:p>
@@ -1243,7 +1248,7 @@
               <w:spacing w:after="40" w:line="240" w:lineRule="auto"/>
             </w:pPr>
             <w:r>
-              <w:t>30</w:t>
+              <w:t>33</w:t>
             </w:r>
           </w:p>
         </w:tc>
@@ -1274,7 +1279,7 @@
               <w:spacing w:after="40" w:line="240" w:lineRule="auto"/>
             </w:pPr>
             <w:r>
-              <w:t>451</w:t>
+              <w:t>475</w:t>
             </w:r>
           </w:p>
         </w:tc>
@@ -1305,7 +1310,7 @@
               <w:spacing w:after="40" w:line="240" w:lineRule="auto"/>
             </w:pPr>
             <w:r>
-              <w:t>76</w:t>
+              <w:t>81</w:t>
             </w:r>
           </w:p>
         </w:tc>
@@ -1336,7 +1341,7 @@
               <w:spacing w:after="40" w:line="240" w:lineRule="auto"/>
             </w:pPr>
             <w:r>
-              <w:t>30</w:t>
+              <w:t>32</w:t>
             </w:r>
           </w:p>
         </w:tc>
@@ -1437,12 +1442,12 @@
     </w:p>
     <w:p>
       <w:r>
-        <w:t>对已落盘的550条请求快照检查，初筛接受的125条均完整编码成功，展开为333个当前回复训练单元，共25033个监督token；最长输入2940 tokens。这是运行中快照，尚未达到256条目标。</w:t>
+        <w:t>对停止后的614条请求快照检查，初筛接受的139条均完整编码成功，展开为367个当前回复训练单元，共27294个监督token；最长输入2940 tokens。有效轨迹尚未达到256条目标。</w:t>
       </w:r>
     </w:p>
     <w:p>
       <w:r>
-        <w:t>333个推理前缀的token哈希与实际API记录逐一相同，规范化消息哈希也相同；历史消息与工具返回不参与当前回复loss。检查没有初始化CUDA，不占用教师推理GPU。</w:t>
+        <w:t>367个推理前缀的token哈希与实际API记录逐一相同，规范化消息哈希也相同；历史消息与工具返回不参与当前回复loss。检查没有初始化CUDA，不占用教师推理GPU。</w:t>
       </w:r>
     </w:p>
     <w:p>
@@ -1468,7 +1473,12 @@
     </w:p>
     <w:p>
       <w:r>
-        <w:t>请求仍在顺序执行；当前初筛132/583。这是训练请求的接受率，不能作为dev或test成功率。</w:t>
+        <w:t>614条已完成请求中，139条通过执行、格式与完整编码检查，接受率22.6%。有效轨迹集中于无工具回答44条、信息不足43条、配置修改39条、失败恢复13条；其余四类没有有效轨迹。这是训练请求的接受率，不能作为dev或test成功率。</w:t>
+      </w:r>
+    </w:p>
+    <w:p>
+      <w:r>
+        <w:t>256条共同提示的蒸馏对照与128/256规模比较尚未执行。139条有效轨迹、全部拒绝记录及中断工作区已保留，不能将本阶段记作蒸馏验收完成。</w:t>
       </w:r>
     </w:p>
     <w:p>
@@ -1661,7 +1671,7 @@
               <w:t>；</w:t>
             </w:r>
             <w:r>
-              <w:t>.local/checks/E16-R01-encoding/records-550-snapshot.jsonl</w:t>
+              <w:t>.local/checks/E16-R01-encoding/records-614-stopped-snapshot.jsonl</w:t>
             </w:r>
             <w:r>
               <w:rPr>
@@ -1671,7 +1681,58 @@
               <w:t>；</w:t>
             </w:r>
             <w:r>
-              <w:t>.local/checks/E16-R01-encoding/records-550-snapshot.inspection.json</w:t>
+              <w:t>.local/checks/E16-R01-encoding/records-614-stopped-snapshot.inspection.json</w:t>
+            </w:r>
+          </w:p>
+        </w:tc>
+      </w:tr>
+      <w:tr>
+        <w:trPr>
+          <w:cantSplit/>
+        </w:trPr>
+        <w:tc>
+          <w:tcPr>
+            <w:tcW w:type="dxa" w:w="2381"/>
+          </w:tcPr>
+          <w:p>
+            <w:pPr>
+              <w:spacing w:after="40" w:line="240" w:lineRule="auto"/>
+            </w:pPr>
+            <w:r>
+              <w:t>停止记录与中断工作区</w:t>
+            </w:r>
+          </w:p>
+        </w:tc>
+        <w:tc>
+          <w:tcPr>
+            <w:tcW w:type="dxa" w:w="7200"/>
+          </w:tcPr>
+          <w:p>
+            <w:pPr>
+              <w:spacing w:after="40" w:line="240" w:lineRule="auto"/>
+            </w:pPr>
+            <w:r>
+              <w:t>experiments/E16/runs/E16-R01.json</w:t>
+            </w:r>
+            <w:r>
+              <w:rPr>
+                <w:rFonts w:ascii="Consolas" w:hAnsi="Consolas"/>
+                <w:sz w:val="20"/>
+              </w:rPr>
+              <w:t>；</w:t>
+            </w:r>
+            <w:r>
+              <w:t>.local/checks/E16-R01-stop/capture.json</w:t>
+            </w:r>
+            <w:r>
+              <w:rPr>
+                <w:rFonts w:ascii="Consolas" w:hAnsi="Consolas"/>
+                <w:sz w:val="20"/>
+              </w:rPr>
+              <w:t>；</w:t>
+            </w:r>
+            <w:r>
+              <w:t>.local/checks/E16-R01-stop/files-manifest.json</w:t>
             </w:r>
           </w:p>
         </w:tc>

</xml_diff>